<commit_message>
Update week 1 progress report
</commit_message>
<xml_diff>
--- a/progress-report/week-01/BCTD T1.docx
+++ b/progress-report/week-01/BCTD T1.docx
@@ -3474,6 +3474,21 @@
                 </w:p>
                 <w:p>
                   <w:pPr>
+                    <w:pStyle w:val="ListParagraph"/>
+                    <w:tabs>
+                      <w:tab w:val="left" w:pos="186"/>
+                    </w:tabs>
+                    <w:spacing w:line="360" w:lineRule="auto"/>
+                    <w:ind w:left="6"/>
+                    <w:rPr>
+                      <w:spacing w:val="6"/>
+                      <w:sz w:val="26"/>
+                      <w:szCs w:val="26"/>
+                    </w:rPr>
+                  </w:pPr>
+                </w:p>
+                <w:p>
+                  <w:pPr>
                     <w:spacing w:before="60" w:after="60" w:line="312" w:lineRule="auto"/>
                     <w:rPr>
                       <w:sz w:val="26"/>
@@ -4430,7 +4445,7 @@
                     <w:ind w:left="6" w:hanging="6"/>
                     <w:jc w:val="both"/>
                     <w:rPr>
-                      <w:spacing w:val="6"/>
+                      <w:spacing w:val="10"/>
                       <w:sz w:val="26"/>
                       <w:szCs w:val="26"/>
                     </w:rPr>
@@ -4438,7 +4453,7 @@
                   <w:proofErr w:type="spellStart"/>
                   <w:r>
                     <w:rPr>
-                      <w:spacing w:val="6"/>
+                      <w:spacing w:val="10"/>
                       <w:sz w:val="26"/>
                       <w:szCs w:val="26"/>
                     </w:rPr>
@@ -4447,16 +4462,16 @@
                   <w:proofErr w:type="spellEnd"/>
                   <w:r>
                     <w:rPr>
-                      <w:spacing w:val="6"/>
-                      <w:sz w:val="26"/>
-                      <w:szCs w:val="26"/>
-                    </w:rPr>
-                    <w:t xml:space="preserve"> </w:t>
-                  </w:r>
-                  <w:proofErr w:type="spellStart"/>
-                  <w:r>
-                    <w:rPr>
-                      <w:spacing w:val="6"/>
+                      <w:spacing w:val="10"/>
+                      <w:sz w:val="26"/>
+                      <w:szCs w:val="26"/>
+                    </w:rPr>
+                    <w:t xml:space="preserve"> </w:t>
+                  </w:r>
+                  <w:proofErr w:type="spellStart"/>
+                  <w:r>
+                    <w:rPr>
+                      <w:spacing w:val="10"/>
                       <w:sz w:val="26"/>
                       <w:szCs w:val="26"/>
                     </w:rPr>
@@ -4465,16 +4480,16 @@
                   <w:proofErr w:type="spellEnd"/>
                   <w:r>
                     <w:rPr>
-                      <w:spacing w:val="6"/>
-                      <w:sz w:val="26"/>
-                      <w:szCs w:val="26"/>
-                    </w:rPr>
-                    <w:t xml:space="preserve"> </w:t>
-                  </w:r>
-                  <w:proofErr w:type="spellStart"/>
-                  <w:r>
-                    <w:rPr>
-                      <w:spacing w:val="6"/>
+                      <w:spacing w:val="10"/>
+                      <w:sz w:val="26"/>
+                      <w:szCs w:val="26"/>
+                    </w:rPr>
+                    <w:t xml:space="preserve"> </w:t>
+                  </w:r>
+                  <w:proofErr w:type="spellStart"/>
+                  <w:r>
+                    <w:rPr>
+                      <w:spacing w:val="10"/>
                       <w:sz w:val="26"/>
                       <w:szCs w:val="26"/>
                     </w:rPr>
@@ -4483,16 +4498,16 @@
                   <w:proofErr w:type="spellEnd"/>
                   <w:r>
                     <w:rPr>
-                      <w:spacing w:val="6"/>
-                      <w:sz w:val="26"/>
-                      <w:szCs w:val="26"/>
-                    </w:rPr>
-                    <w:t xml:space="preserve"> </w:t>
-                  </w:r>
-                  <w:proofErr w:type="spellStart"/>
-                  <w:r>
-                    <w:rPr>
-                      <w:spacing w:val="6"/>
+                      <w:spacing w:val="10"/>
+                      <w:sz w:val="26"/>
+                      <w:szCs w:val="26"/>
+                    </w:rPr>
+                    <w:t xml:space="preserve"> </w:t>
+                  </w:r>
+                  <w:proofErr w:type="spellStart"/>
+                  <w:r>
+                    <w:rPr>
+                      <w:spacing w:val="10"/>
                       <w:sz w:val="26"/>
                       <w:szCs w:val="26"/>
                     </w:rPr>
@@ -4501,16 +4516,16 @@
                   <w:proofErr w:type="spellEnd"/>
                   <w:r>
                     <w:rPr>
-                      <w:spacing w:val="6"/>
-                      <w:sz w:val="26"/>
-                      <w:szCs w:val="26"/>
-                    </w:rPr>
-                    <w:t xml:space="preserve"> </w:t>
-                  </w:r>
-                  <w:proofErr w:type="spellStart"/>
-                  <w:r>
-                    <w:rPr>
-                      <w:spacing w:val="6"/>
+                      <w:spacing w:val="10"/>
+                      <w:sz w:val="26"/>
+                      <w:szCs w:val="26"/>
+                    </w:rPr>
+                    <w:t xml:space="preserve"> </w:t>
+                  </w:r>
+                  <w:proofErr w:type="spellStart"/>
+                  <w:r>
+                    <w:rPr>
+                      <w:spacing w:val="10"/>
                       <w:sz w:val="26"/>
                       <w:szCs w:val="26"/>
                     </w:rPr>
@@ -4519,16 +4534,16 @@
                   <w:proofErr w:type="spellEnd"/>
                   <w:r>
                     <w:rPr>
-                      <w:spacing w:val="6"/>
-                      <w:sz w:val="26"/>
-                      <w:szCs w:val="26"/>
-                    </w:rPr>
-                    <w:t xml:space="preserve"> </w:t>
-                  </w:r>
-                  <w:proofErr w:type="spellStart"/>
-                  <w:r>
-                    <w:rPr>
-                      <w:spacing w:val="6"/>
+                      <w:spacing w:val="10"/>
+                      <w:sz w:val="26"/>
+                      <w:szCs w:val="26"/>
+                    </w:rPr>
+                    <w:t xml:space="preserve"> </w:t>
+                  </w:r>
+                  <w:proofErr w:type="spellStart"/>
+                  <w:r>
+                    <w:rPr>
+                      <w:spacing w:val="10"/>
                       <w:sz w:val="26"/>
                       <w:szCs w:val="26"/>
                     </w:rPr>
@@ -4537,16 +4552,16 @@
                   <w:proofErr w:type="spellEnd"/>
                   <w:r>
                     <w:rPr>
-                      <w:spacing w:val="6"/>
-                      <w:sz w:val="26"/>
-                      <w:szCs w:val="26"/>
-                    </w:rPr>
-                    <w:t xml:space="preserve"> </w:t>
-                  </w:r>
-                  <w:proofErr w:type="spellStart"/>
-                  <w:r>
-                    <w:rPr>
-                      <w:spacing w:val="6"/>
+                      <w:spacing w:val="10"/>
+                      <w:sz w:val="26"/>
+                      <w:szCs w:val="26"/>
+                    </w:rPr>
+                    <w:t xml:space="preserve"> </w:t>
+                  </w:r>
+                  <w:proofErr w:type="spellStart"/>
+                  <w:r>
+                    <w:rPr>
+                      <w:spacing w:val="10"/>
                       <w:sz w:val="26"/>
                       <w:szCs w:val="26"/>
                     </w:rPr>
@@ -4555,16 +4570,16 @@
                   <w:proofErr w:type="spellEnd"/>
                   <w:r>
                     <w:rPr>
-                      <w:spacing w:val="6"/>
-                      <w:sz w:val="26"/>
-                      <w:szCs w:val="26"/>
-                    </w:rPr>
-                    <w:t xml:space="preserve"> </w:t>
-                  </w:r>
-                  <w:proofErr w:type="spellStart"/>
-                  <w:r>
-                    <w:rPr>
-                      <w:spacing w:val="6"/>
+                      <w:spacing w:val="10"/>
+                      <w:sz w:val="26"/>
+                      <w:szCs w:val="26"/>
+                    </w:rPr>
+                    <w:t xml:space="preserve"> </w:t>
+                  </w:r>
+                  <w:proofErr w:type="spellStart"/>
+                  <w:r>
+                    <w:rPr>
+                      <w:spacing w:val="10"/>
                       <w:sz w:val="26"/>
                       <w:szCs w:val="26"/>
                     </w:rPr>
@@ -4573,7 +4588,7 @@
                   <w:proofErr w:type="spellEnd"/>
                   <w:r>
                     <w:rPr>
-                      <w:spacing w:val="6"/>
+                      <w:spacing w:val="10"/>
                       <w:sz w:val="26"/>
                       <w:szCs w:val="26"/>
                     </w:rPr>
@@ -4582,7 +4597,7 @@
                   <w:proofErr w:type="spellStart"/>
                   <w:r>
                     <w:rPr>
-                      <w:spacing w:val="6"/>
+                      <w:spacing w:val="10"/>
                       <w:sz w:val="26"/>
                       <w:szCs w:val="26"/>
                     </w:rPr>
@@ -4591,16 +4606,16 @@
                   <w:proofErr w:type="spellEnd"/>
                   <w:r>
                     <w:rPr>
-                      <w:spacing w:val="6"/>
-                      <w:sz w:val="26"/>
-                      <w:szCs w:val="26"/>
-                    </w:rPr>
-                    <w:t xml:space="preserve"> </w:t>
-                  </w:r>
-                  <w:proofErr w:type="spellStart"/>
-                  <w:r>
-                    <w:rPr>
-                      <w:spacing w:val="6"/>
+                      <w:spacing w:val="10"/>
+                      <w:sz w:val="26"/>
+                      <w:szCs w:val="26"/>
+                    </w:rPr>
+                    <w:t xml:space="preserve"> </w:t>
+                  </w:r>
+                  <w:proofErr w:type="spellStart"/>
+                  <w:r>
+                    <w:rPr>
+                      <w:spacing w:val="10"/>
                       <w:sz w:val="26"/>
                       <w:szCs w:val="26"/>
                     </w:rPr>
@@ -4609,7 +4624,7 @@
                   <w:proofErr w:type="spellEnd"/>
                   <w:r>
                     <w:rPr>
-                      <w:spacing w:val="6"/>
+                      <w:spacing w:val="10"/>
                       <w:sz w:val="26"/>
                       <w:szCs w:val="26"/>
                     </w:rPr>
@@ -4618,7 +4633,7 @@
                   <w:proofErr w:type="spellStart"/>
                   <w:r>
                     <w:rPr>
-                      <w:spacing w:val="6"/>
+                      <w:spacing w:val="10"/>
                       <w:sz w:val="26"/>
                       <w:szCs w:val="26"/>
                     </w:rPr>
@@ -4627,16 +4642,16 @@
                   <w:proofErr w:type="spellEnd"/>
                   <w:r>
                     <w:rPr>
-                      <w:spacing w:val="6"/>
-                      <w:sz w:val="26"/>
-                      <w:szCs w:val="26"/>
-                    </w:rPr>
-                    <w:t xml:space="preserve"> </w:t>
-                  </w:r>
-                  <w:proofErr w:type="spellStart"/>
-                  <w:r>
-                    <w:rPr>
-                      <w:spacing w:val="6"/>
+                      <w:spacing w:val="10"/>
+                      <w:sz w:val="26"/>
+                      <w:szCs w:val="26"/>
+                    </w:rPr>
+                    <w:t xml:space="preserve"> </w:t>
+                  </w:r>
+                  <w:proofErr w:type="spellStart"/>
+                  <w:r>
+                    <w:rPr>
+                      <w:spacing w:val="10"/>
                       <w:sz w:val="26"/>
                       <w:szCs w:val="26"/>
                     </w:rPr>
@@ -4645,16 +4660,16 @@
                   <w:proofErr w:type="spellEnd"/>
                   <w:r>
                     <w:rPr>
-                      <w:spacing w:val="6"/>
-                      <w:sz w:val="26"/>
-                      <w:szCs w:val="26"/>
-                    </w:rPr>
-                    <w:t xml:space="preserve"> </w:t>
-                  </w:r>
-                  <w:proofErr w:type="spellStart"/>
-                  <w:r>
-                    <w:rPr>
-                      <w:spacing w:val="6"/>
+                      <w:spacing w:val="10"/>
+                      <w:sz w:val="26"/>
+                      <w:szCs w:val="26"/>
+                    </w:rPr>
+                    <w:t xml:space="preserve"> </w:t>
+                  </w:r>
+                  <w:proofErr w:type="spellStart"/>
+                  <w:r>
+                    <w:rPr>
+                      <w:spacing w:val="10"/>
                       <w:sz w:val="26"/>
                       <w:szCs w:val="26"/>
                     </w:rPr>
@@ -4672,7 +4687,7 @@
                     <w:ind w:left="6"/>
                     <w:jc w:val="both"/>
                     <w:rPr>
-                      <w:spacing w:val="2"/>
+                      <w:spacing w:val="4"/>
                       <w:sz w:val="26"/>
                       <w:szCs w:val="26"/>
                     </w:rPr>
@@ -4687,7 +4702,7 @@
                   </w:r>
                   <w:r>
                     <w:rPr>
-                      <w:spacing w:val="2"/>
+                      <w:spacing w:val="4"/>
                       <w:sz w:val="26"/>
                       <w:szCs w:val="26"/>
                     </w:rPr>
@@ -4696,7 +4711,7 @@
                   <w:proofErr w:type="spellStart"/>
                   <w:r>
                     <w:rPr>
-                      <w:spacing w:val="2"/>
+                      <w:spacing w:val="4"/>
                       <w:sz w:val="26"/>
                       <w:szCs w:val="26"/>
                     </w:rPr>
@@ -4705,16 +4720,16 @@
                   <w:proofErr w:type="spellEnd"/>
                   <w:r>
                     <w:rPr>
-                      <w:spacing w:val="2"/>
-                      <w:sz w:val="26"/>
-                      <w:szCs w:val="26"/>
-                    </w:rPr>
-                    <w:t xml:space="preserve"> </w:t>
-                  </w:r>
-                  <w:proofErr w:type="spellStart"/>
-                  <w:r>
-                    <w:rPr>
-                      <w:spacing w:val="2"/>
+                      <w:spacing w:val="4"/>
+                      <w:sz w:val="26"/>
+                      <w:szCs w:val="26"/>
+                    </w:rPr>
+                    <w:t xml:space="preserve"> </w:t>
+                  </w:r>
+                  <w:proofErr w:type="spellStart"/>
+                  <w:r>
+                    <w:rPr>
+                      <w:spacing w:val="4"/>
                       <w:sz w:val="26"/>
                       <w:szCs w:val="26"/>
                     </w:rPr>
@@ -4723,7 +4738,7 @@
                   <w:proofErr w:type="spellEnd"/>
                   <w:r>
                     <w:rPr>
-                      <w:spacing w:val="2"/>
+                      <w:spacing w:val="4"/>
                       <w:sz w:val="26"/>
                       <w:szCs w:val="26"/>
                     </w:rPr>
@@ -4732,7 +4747,7 @@
                   <w:proofErr w:type="spellStart"/>
                   <w:r>
                     <w:rPr>
-                      <w:spacing w:val="2"/>
+                      <w:spacing w:val="4"/>
                       <w:sz w:val="26"/>
                       <w:szCs w:val="26"/>
                     </w:rPr>
@@ -4741,16 +4756,16 @@
                   <w:proofErr w:type="spellEnd"/>
                   <w:r>
                     <w:rPr>
-                      <w:spacing w:val="2"/>
-                      <w:sz w:val="26"/>
-                      <w:szCs w:val="26"/>
-                    </w:rPr>
-                    <w:t xml:space="preserve"> </w:t>
-                  </w:r>
-                  <w:proofErr w:type="spellStart"/>
-                  <w:r>
-                    <w:rPr>
-                      <w:spacing w:val="2"/>
+                      <w:spacing w:val="4"/>
+                      <w:sz w:val="26"/>
+                      <w:szCs w:val="26"/>
+                    </w:rPr>
+                    <w:t xml:space="preserve"> </w:t>
+                  </w:r>
+                  <w:proofErr w:type="spellStart"/>
+                  <w:r>
+                    <w:rPr>
+                      <w:spacing w:val="4"/>
                       <w:sz w:val="26"/>
                       <w:szCs w:val="26"/>
                     </w:rPr>
@@ -4759,16 +4774,16 @@
                   <w:proofErr w:type="spellEnd"/>
                   <w:r>
                     <w:rPr>
-                      <w:spacing w:val="2"/>
-                      <w:sz w:val="26"/>
-                      <w:szCs w:val="26"/>
-                    </w:rPr>
-                    <w:t xml:space="preserve"> </w:t>
-                  </w:r>
-                  <w:proofErr w:type="spellStart"/>
-                  <w:r>
-                    <w:rPr>
-                      <w:spacing w:val="2"/>
+                      <w:spacing w:val="4"/>
+                      <w:sz w:val="26"/>
+                      <w:szCs w:val="26"/>
+                    </w:rPr>
+                    <w:t xml:space="preserve"> </w:t>
+                  </w:r>
+                  <w:proofErr w:type="spellStart"/>
+                  <w:r>
+                    <w:rPr>
+                      <w:spacing w:val="4"/>
                       <w:sz w:val="26"/>
                       <w:szCs w:val="26"/>
                     </w:rPr>
@@ -4777,16 +4792,16 @@
                   <w:proofErr w:type="spellEnd"/>
                   <w:r>
                     <w:rPr>
-                      <w:spacing w:val="2"/>
-                      <w:sz w:val="26"/>
-                      <w:szCs w:val="26"/>
-                    </w:rPr>
-                    <w:t xml:space="preserve"> </w:t>
-                  </w:r>
-                  <w:proofErr w:type="spellStart"/>
-                  <w:r>
-                    <w:rPr>
-                      <w:spacing w:val="2"/>
+                      <w:spacing w:val="4"/>
+                      <w:sz w:val="26"/>
+                      <w:szCs w:val="26"/>
+                    </w:rPr>
+                    <w:t xml:space="preserve"> </w:t>
+                  </w:r>
+                  <w:proofErr w:type="spellStart"/>
+                  <w:r>
+                    <w:rPr>
+                      <w:spacing w:val="4"/>
                       <w:sz w:val="26"/>
                       <w:szCs w:val="26"/>
                     </w:rPr>
@@ -4795,16 +4810,16 @@
                   <w:proofErr w:type="spellEnd"/>
                   <w:r>
                     <w:rPr>
-                      <w:spacing w:val="2"/>
-                      <w:sz w:val="26"/>
-                      <w:szCs w:val="26"/>
-                    </w:rPr>
-                    <w:t xml:space="preserve"> </w:t>
-                  </w:r>
-                  <w:proofErr w:type="spellStart"/>
-                  <w:r>
-                    <w:rPr>
-                      <w:spacing w:val="2"/>
+                      <w:spacing w:val="4"/>
+                      <w:sz w:val="26"/>
+                      <w:szCs w:val="26"/>
+                    </w:rPr>
+                    <w:t xml:space="preserve"> </w:t>
+                  </w:r>
+                  <w:proofErr w:type="spellStart"/>
+                  <w:r>
+                    <w:rPr>
+                      <w:spacing w:val="4"/>
                       <w:sz w:val="26"/>
                       <w:szCs w:val="26"/>
                     </w:rPr>
@@ -4813,7 +4828,7 @@
                   <w:proofErr w:type="spellEnd"/>
                   <w:r>
                     <w:rPr>
-                      <w:spacing w:val="2"/>
+                      <w:spacing w:val="4"/>
                       <w:sz w:val="26"/>
                       <w:szCs w:val="26"/>
                     </w:rPr>
@@ -4822,7 +4837,7 @@
                   <w:proofErr w:type="spellStart"/>
                   <w:r>
                     <w:rPr>
-                      <w:spacing w:val="2"/>
+                      <w:spacing w:val="4"/>
                       <w:sz w:val="26"/>
                       <w:szCs w:val="26"/>
                     </w:rPr>
@@ -4831,16 +4846,16 @@
                   <w:proofErr w:type="spellEnd"/>
                   <w:r>
                     <w:rPr>
-                      <w:spacing w:val="2"/>
-                      <w:sz w:val="26"/>
-                      <w:szCs w:val="26"/>
-                    </w:rPr>
-                    <w:t xml:space="preserve"> </w:t>
-                  </w:r>
-                  <w:proofErr w:type="spellStart"/>
-                  <w:r>
-                    <w:rPr>
-                      <w:spacing w:val="2"/>
+                      <w:spacing w:val="4"/>
+                      <w:sz w:val="26"/>
+                      <w:szCs w:val="26"/>
+                    </w:rPr>
+                    <w:t xml:space="preserve"> </w:t>
+                  </w:r>
+                  <w:proofErr w:type="spellStart"/>
+                  <w:r>
+                    <w:rPr>
+                      <w:spacing w:val="4"/>
                       <w:sz w:val="26"/>
                       <w:szCs w:val="26"/>
                     </w:rPr>
@@ -4849,16 +4864,16 @@
                   <w:proofErr w:type="spellEnd"/>
                   <w:r>
                     <w:rPr>
-                      <w:spacing w:val="2"/>
-                      <w:sz w:val="26"/>
-                      <w:szCs w:val="26"/>
-                    </w:rPr>
-                    <w:t xml:space="preserve"> </w:t>
-                  </w:r>
-                  <w:proofErr w:type="spellStart"/>
-                  <w:r>
-                    <w:rPr>
-                      <w:spacing w:val="2"/>
+                      <w:spacing w:val="4"/>
+                      <w:sz w:val="26"/>
+                      <w:szCs w:val="26"/>
+                    </w:rPr>
+                    <w:t xml:space="preserve"> </w:t>
+                  </w:r>
+                  <w:proofErr w:type="spellStart"/>
+                  <w:r>
+                    <w:rPr>
+                      <w:spacing w:val="4"/>
                       <w:sz w:val="26"/>
                       <w:szCs w:val="26"/>
                     </w:rPr>
@@ -4867,16 +4882,16 @@
                   <w:proofErr w:type="spellEnd"/>
                   <w:r>
                     <w:rPr>
-                      <w:spacing w:val="2"/>
-                      <w:sz w:val="26"/>
-                      <w:szCs w:val="26"/>
-                    </w:rPr>
-                    <w:t xml:space="preserve"> </w:t>
-                  </w:r>
-                  <w:proofErr w:type="spellStart"/>
-                  <w:r>
-                    <w:rPr>
-                      <w:spacing w:val="2"/>
+                      <w:spacing w:val="4"/>
+                      <w:sz w:val="26"/>
+                      <w:szCs w:val="26"/>
+                    </w:rPr>
+                    <w:t xml:space="preserve"> </w:t>
+                  </w:r>
+                  <w:proofErr w:type="spellStart"/>
+                  <w:r>
+                    <w:rPr>
+                      <w:spacing w:val="4"/>
                       <w:sz w:val="26"/>
                       <w:szCs w:val="26"/>
                     </w:rPr>
@@ -4885,16 +4900,16 @@
                   <w:proofErr w:type="spellEnd"/>
                   <w:r>
                     <w:rPr>
-                      <w:spacing w:val="2"/>
-                      <w:sz w:val="26"/>
-                      <w:szCs w:val="26"/>
-                    </w:rPr>
-                    <w:t xml:space="preserve"> </w:t>
-                  </w:r>
-                  <w:proofErr w:type="spellStart"/>
-                  <w:r>
-                    <w:rPr>
-                      <w:spacing w:val="2"/>
+                      <w:spacing w:val="4"/>
+                      <w:sz w:val="26"/>
+                      <w:szCs w:val="26"/>
+                    </w:rPr>
+                    <w:t xml:space="preserve"> </w:t>
+                  </w:r>
+                  <w:proofErr w:type="spellStart"/>
+                  <w:r>
+                    <w:rPr>
+                      <w:spacing w:val="4"/>
                       <w:sz w:val="26"/>
                       <w:szCs w:val="26"/>
                     </w:rPr>
@@ -4903,16 +4918,16 @@
                   <w:proofErr w:type="spellEnd"/>
                   <w:r>
                     <w:rPr>
-                      <w:spacing w:val="2"/>
-                      <w:sz w:val="26"/>
-                      <w:szCs w:val="26"/>
-                    </w:rPr>
-                    <w:t xml:space="preserve"> </w:t>
-                  </w:r>
-                  <w:proofErr w:type="spellStart"/>
-                  <w:r>
-                    <w:rPr>
-                      <w:spacing w:val="2"/>
+                      <w:spacing w:val="4"/>
+                      <w:sz w:val="26"/>
+                      <w:szCs w:val="26"/>
+                    </w:rPr>
+                    <w:t xml:space="preserve"> </w:t>
+                  </w:r>
+                  <w:proofErr w:type="spellStart"/>
+                  <w:r>
+                    <w:rPr>
+                      <w:spacing w:val="4"/>
                       <w:sz w:val="26"/>
                       <w:szCs w:val="26"/>
                     </w:rPr>
@@ -4921,16 +4936,16 @@
                   <w:proofErr w:type="spellEnd"/>
                   <w:r>
                     <w:rPr>
-                      <w:spacing w:val="2"/>
-                      <w:sz w:val="26"/>
-                      <w:szCs w:val="26"/>
-                    </w:rPr>
-                    <w:t xml:space="preserve"> </w:t>
-                  </w:r>
-                  <w:proofErr w:type="spellStart"/>
-                  <w:r>
-                    <w:rPr>
-                      <w:spacing w:val="2"/>
+                      <w:spacing w:val="4"/>
+                      <w:sz w:val="26"/>
+                      <w:szCs w:val="26"/>
+                    </w:rPr>
+                    <w:t xml:space="preserve"> </w:t>
+                  </w:r>
+                  <w:proofErr w:type="spellStart"/>
+                  <w:r>
+                    <w:rPr>
+                      <w:spacing w:val="4"/>
                       <w:sz w:val="26"/>
                       <w:szCs w:val="26"/>
                     </w:rPr>
@@ -4939,16 +4954,16 @@
                   <w:proofErr w:type="spellEnd"/>
                   <w:r>
                     <w:rPr>
-                      <w:spacing w:val="2"/>
-                      <w:sz w:val="26"/>
-                      <w:szCs w:val="26"/>
-                    </w:rPr>
-                    <w:t xml:space="preserve"> </w:t>
-                  </w:r>
-                  <w:proofErr w:type="spellStart"/>
-                  <w:r>
-                    <w:rPr>
-                      <w:spacing w:val="2"/>
+                      <w:spacing w:val="4"/>
+                      <w:sz w:val="26"/>
+                      <w:szCs w:val="26"/>
+                    </w:rPr>
+                    <w:t xml:space="preserve"> </w:t>
+                  </w:r>
+                  <w:proofErr w:type="spellStart"/>
+                  <w:r>
+                    <w:rPr>
+                      <w:spacing w:val="4"/>
                       <w:sz w:val="26"/>
                       <w:szCs w:val="26"/>
                     </w:rPr>
@@ -4957,16 +4972,16 @@
                   <w:proofErr w:type="spellEnd"/>
                   <w:r>
                     <w:rPr>
-                      <w:spacing w:val="2"/>
-                      <w:sz w:val="26"/>
-                      <w:szCs w:val="26"/>
-                    </w:rPr>
-                    <w:t xml:space="preserve"> </w:t>
-                  </w:r>
-                  <w:proofErr w:type="spellStart"/>
-                  <w:r>
-                    <w:rPr>
-                      <w:spacing w:val="2"/>
+                      <w:spacing w:val="4"/>
+                      <w:sz w:val="26"/>
+                      <w:szCs w:val="26"/>
+                    </w:rPr>
+                    <w:t xml:space="preserve"> </w:t>
+                  </w:r>
+                  <w:proofErr w:type="spellStart"/>
+                  <w:r>
+                    <w:rPr>
+                      <w:spacing w:val="4"/>
                       <w:sz w:val="26"/>
                       <w:szCs w:val="26"/>
                     </w:rPr>
@@ -4975,16 +4990,16 @@
                   <w:proofErr w:type="spellEnd"/>
                   <w:r>
                     <w:rPr>
-                      <w:spacing w:val="2"/>
-                      <w:sz w:val="26"/>
-                      <w:szCs w:val="26"/>
-                    </w:rPr>
-                    <w:t xml:space="preserve"> </w:t>
-                  </w:r>
-                  <w:proofErr w:type="spellStart"/>
-                  <w:r>
-                    <w:rPr>
-                      <w:spacing w:val="2"/>
+                      <w:spacing w:val="4"/>
+                      <w:sz w:val="26"/>
+                      <w:szCs w:val="26"/>
+                    </w:rPr>
+                    <w:t xml:space="preserve"> </w:t>
+                  </w:r>
+                  <w:proofErr w:type="spellStart"/>
+                  <w:r>
+                    <w:rPr>
+                      <w:spacing w:val="4"/>
                       <w:sz w:val="26"/>
                       <w:szCs w:val="26"/>
                     </w:rPr>
@@ -4993,16 +5008,16 @@
                   <w:proofErr w:type="spellEnd"/>
                   <w:r>
                     <w:rPr>
-                      <w:spacing w:val="2"/>
-                      <w:sz w:val="26"/>
-                      <w:szCs w:val="26"/>
-                    </w:rPr>
-                    <w:t xml:space="preserve"> </w:t>
-                  </w:r>
-                  <w:proofErr w:type="spellStart"/>
-                  <w:r>
-                    <w:rPr>
-                      <w:spacing w:val="2"/>
+                      <w:spacing w:val="4"/>
+                      <w:sz w:val="26"/>
+                      <w:szCs w:val="26"/>
+                    </w:rPr>
+                    <w:t xml:space="preserve"> </w:t>
+                  </w:r>
+                  <w:proofErr w:type="spellStart"/>
+                  <w:r>
+                    <w:rPr>
+                      <w:spacing w:val="4"/>
                       <w:sz w:val="26"/>
                       <w:szCs w:val="26"/>
                     </w:rPr>
@@ -5011,7 +5026,7 @@
                   <w:proofErr w:type="spellEnd"/>
                   <w:r>
                     <w:rPr>
-                      <w:spacing w:val="2"/>
+                      <w:spacing w:val="4"/>
                       <w:sz w:val="26"/>
                       <w:szCs w:val="26"/>
                     </w:rPr>
@@ -5020,7 +5035,7 @@
                   <w:proofErr w:type="spellStart"/>
                   <w:r>
                     <w:rPr>
-                      <w:spacing w:val="2"/>
+                      <w:spacing w:val="4"/>
                       <w:sz w:val="26"/>
                       <w:szCs w:val="26"/>
                     </w:rPr>
@@ -5029,16 +5044,16 @@
                   <w:proofErr w:type="spellEnd"/>
                   <w:r>
                     <w:rPr>
-                      <w:spacing w:val="2"/>
-                      <w:sz w:val="26"/>
-                      <w:szCs w:val="26"/>
-                    </w:rPr>
-                    <w:t xml:space="preserve"> </w:t>
-                  </w:r>
-                  <w:proofErr w:type="spellStart"/>
-                  <w:r>
-                    <w:rPr>
-                      <w:spacing w:val="2"/>
+                      <w:spacing w:val="4"/>
+                      <w:sz w:val="26"/>
+                      <w:szCs w:val="26"/>
+                    </w:rPr>
+                    <w:t xml:space="preserve"> </w:t>
+                  </w:r>
+                  <w:proofErr w:type="spellStart"/>
+                  <w:r>
+                    <w:rPr>
+                      <w:spacing w:val="4"/>
                       <w:sz w:val="26"/>
                       <w:szCs w:val="26"/>
                     </w:rPr>
@@ -5047,16 +5062,16 @@
                   <w:proofErr w:type="spellEnd"/>
                   <w:r>
                     <w:rPr>
-                      <w:spacing w:val="2"/>
-                      <w:sz w:val="26"/>
-                      <w:szCs w:val="26"/>
-                    </w:rPr>
-                    <w:t xml:space="preserve"> </w:t>
-                  </w:r>
-                  <w:proofErr w:type="spellStart"/>
-                  <w:r>
-                    <w:rPr>
-                      <w:spacing w:val="2"/>
+                      <w:spacing w:val="4"/>
+                      <w:sz w:val="26"/>
+                      <w:szCs w:val="26"/>
+                    </w:rPr>
+                    <w:t xml:space="preserve"> </w:t>
+                  </w:r>
+                  <w:proofErr w:type="spellStart"/>
+                  <w:r>
+                    <w:rPr>
+                      <w:spacing w:val="4"/>
                       <w:sz w:val="26"/>
                       <w:szCs w:val="26"/>
                     </w:rPr>
@@ -5065,16 +5080,16 @@
                   <w:proofErr w:type="spellEnd"/>
                   <w:r>
                     <w:rPr>
-                      <w:spacing w:val="2"/>
-                      <w:sz w:val="26"/>
-                      <w:szCs w:val="26"/>
-                    </w:rPr>
-                    <w:t xml:space="preserve"> </w:t>
-                  </w:r>
-                  <w:proofErr w:type="spellStart"/>
-                  <w:r>
-                    <w:rPr>
-                      <w:spacing w:val="2"/>
+                      <w:spacing w:val="4"/>
+                      <w:sz w:val="26"/>
+                      <w:szCs w:val="26"/>
+                    </w:rPr>
+                    <w:t xml:space="preserve"> </w:t>
+                  </w:r>
+                  <w:proofErr w:type="spellStart"/>
+                  <w:r>
+                    <w:rPr>
+                      <w:spacing w:val="4"/>
                       <w:sz w:val="26"/>
                       <w:szCs w:val="26"/>
                     </w:rPr>
@@ -5083,16 +5098,16 @@
                   <w:proofErr w:type="spellEnd"/>
                   <w:r>
                     <w:rPr>
-                      <w:spacing w:val="2"/>
-                      <w:sz w:val="26"/>
-                      <w:szCs w:val="26"/>
-                    </w:rPr>
-                    <w:t xml:space="preserve"> </w:t>
-                  </w:r>
-                  <w:proofErr w:type="spellStart"/>
-                  <w:r>
-                    <w:rPr>
-                      <w:spacing w:val="2"/>
+                      <w:spacing w:val="4"/>
+                      <w:sz w:val="26"/>
+                      <w:szCs w:val="26"/>
+                    </w:rPr>
+                    <w:t xml:space="preserve"> </w:t>
+                  </w:r>
+                  <w:proofErr w:type="spellStart"/>
+                  <w:r>
+                    <w:rPr>
+                      <w:spacing w:val="4"/>
                       <w:sz w:val="26"/>
                       <w:szCs w:val="26"/>
                     </w:rPr>
@@ -5101,16 +5116,16 @@
                   <w:proofErr w:type="spellEnd"/>
                   <w:r>
                     <w:rPr>
-                      <w:spacing w:val="2"/>
-                      <w:sz w:val="26"/>
-                      <w:szCs w:val="26"/>
-                    </w:rPr>
-                    <w:t xml:space="preserve"> </w:t>
-                  </w:r>
-                  <w:proofErr w:type="spellStart"/>
-                  <w:r>
-                    <w:rPr>
-                      <w:spacing w:val="2"/>
+                      <w:spacing w:val="4"/>
+                      <w:sz w:val="26"/>
+                      <w:szCs w:val="26"/>
+                    </w:rPr>
+                    <w:t xml:space="preserve"> </w:t>
+                  </w:r>
+                  <w:proofErr w:type="spellStart"/>
+                  <w:r>
+                    <w:rPr>
+                      <w:spacing w:val="4"/>
                       <w:sz w:val="26"/>
                       <w:szCs w:val="26"/>
                     </w:rPr>
@@ -5119,16 +5134,16 @@
                   <w:proofErr w:type="spellEnd"/>
                   <w:r>
                     <w:rPr>
-                      <w:spacing w:val="2"/>
-                      <w:sz w:val="26"/>
-                      <w:szCs w:val="26"/>
-                    </w:rPr>
-                    <w:t xml:space="preserve"> </w:t>
-                  </w:r>
-                  <w:proofErr w:type="spellStart"/>
-                  <w:r>
-                    <w:rPr>
-                      <w:spacing w:val="2"/>
+                      <w:spacing w:val="4"/>
+                      <w:sz w:val="26"/>
+                      <w:szCs w:val="26"/>
+                    </w:rPr>
+                    <w:t xml:space="preserve"> </w:t>
+                  </w:r>
+                  <w:proofErr w:type="spellStart"/>
+                  <w:r>
+                    <w:rPr>
+                      <w:spacing w:val="4"/>
                       <w:sz w:val="26"/>
                       <w:szCs w:val="26"/>
                     </w:rPr>
@@ -5137,16 +5152,16 @@
                   <w:proofErr w:type="spellEnd"/>
                   <w:r>
                     <w:rPr>
-                      <w:spacing w:val="2"/>
-                      <w:sz w:val="26"/>
-                      <w:szCs w:val="26"/>
-                    </w:rPr>
-                    <w:t xml:space="preserve"> </w:t>
-                  </w:r>
-                  <w:proofErr w:type="spellStart"/>
-                  <w:r>
-                    <w:rPr>
-                      <w:spacing w:val="2"/>
+                      <w:spacing w:val="4"/>
+                      <w:sz w:val="26"/>
+                      <w:szCs w:val="26"/>
+                    </w:rPr>
+                    <w:t xml:space="preserve"> </w:t>
+                  </w:r>
+                  <w:proofErr w:type="spellStart"/>
+                  <w:r>
+                    <w:rPr>
+                      <w:spacing w:val="4"/>
                       <w:sz w:val="26"/>
                       <w:szCs w:val="26"/>
                     </w:rPr>
@@ -5155,16 +5170,16 @@
                   <w:proofErr w:type="spellEnd"/>
                   <w:r>
                     <w:rPr>
-                      <w:spacing w:val="2"/>
-                      <w:sz w:val="26"/>
-                      <w:szCs w:val="26"/>
-                    </w:rPr>
-                    <w:t xml:space="preserve"> </w:t>
-                  </w:r>
-                  <w:proofErr w:type="spellStart"/>
-                  <w:r>
-                    <w:rPr>
-                      <w:spacing w:val="2"/>
+                      <w:spacing w:val="4"/>
+                      <w:sz w:val="26"/>
+                      <w:szCs w:val="26"/>
+                    </w:rPr>
+                    <w:t xml:space="preserve"> </w:t>
+                  </w:r>
+                  <w:proofErr w:type="spellStart"/>
+                  <w:r>
+                    <w:rPr>
+                      <w:spacing w:val="4"/>
                       <w:sz w:val="26"/>
                       <w:szCs w:val="26"/>
                     </w:rPr>
@@ -5493,12 +5508,20 @@
                       <w:sz w:val="26"/>
                       <w:szCs w:val="26"/>
                     </w:rPr>
-                    <w:t xml:space="preserve">Tài </w:t>
-                  </w:r>
-                  <w:proofErr w:type="spellStart"/>
-                  <w:r>
-                    <w:rPr>
-                      <w:spacing w:val="-8"/>
+                    <w:t>T</w:t>
+                  </w:r>
+                  <w:r>
+                    <w:rPr>
+                      <w:spacing w:val="4"/>
+                      <w:sz w:val="26"/>
+                      <w:szCs w:val="26"/>
+                    </w:rPr>
+                    <w:t xml:space="preserve">ài </w:t>
+                  </w:r>
+                  <w:proofErr w:type="spellStart"/>
+                  <w:r>
+                    <w:rPr>
+                      <w:spacing w:val="4"/>
                       <w:sz w:val="26"/>
                       <w:szCs w:val="26"/>
                     </w:rPr>
@@ -5507,16 +5530,16 @@
                   <w:proofErr w:type="spellEnd"/>
                   <w:r>
                     <w:rPr>
-                      <w:spacing w:val="-8"/>
-                      <w:sz w:val="26"/>
-                      <w:szCs w:val="26"/>
-                    </w:rPr>
-                    <w:t xml:space="preserve"> </w:t>
-                  </w:r>
-                  <w:proofErr w:type="spellStart"/>
-                  <w:r>
-                    <w:rPr>
-                      <w:spacing w:val="-8"/>
+                      <w:spacing w:val="4"/>
+                      <w:sz w:val="26"/>
+                      <w:szCs w:val="26"/>
+                    </w:rPr>
+                    <w:t xml:space="preserve"> </w:t>
+                  </w:r>
+                  <w:proofErr w:type="spellStart"/>
+                  <w:r>
+                    <w:rPr>
+                      <w:spacing w:val="4"/>
                       <w:sz w:val="26"/>
                       <w:szCs w:val="26"/>
                     </w:rPr>
@@ -5525,16 +5548,16 @@
                   <w:proofErr w:type="spellEnd"/>
                   <w:r>
                     <w:rPr>
-                      <w:spacing w:val="-8"/>
-                      <w:sz w:val="26"/>
-                      <w:szCs w:val="26"/>
-                    </w:rPr>
-                    <w:t xml:space="preserve"> </w:t>
-                  </w:r>
-                  <w:proofErr w:type="spellStart"/>
-                  <w:r>
-                    <w:rPr>
-                      <w:spacing w:val="-8"/>
+                      <w:spacing w:val="4"/>
+                      <w:sz w:val="26"/>
+                      <w:szCs w:val="26"/>
+                    </w:rPr>
+                    <w:t xml:space="preserve"> </w:t>
+                  </w:r>
+                  <w:proofErr w:type="spellStart"/>
+                  <w:r>
+                    <w:rPr>
+                      <w:spacing w:val="4"/>
                       <w:sz w:val="26"/>
                       <w:szCs w:val="26"/>
                     </w:rPr>
@@ -5543,16 +5566,16 @@
                   <w:proofErr w:type="spellEnd"/>
                   <w:r>
                     <w:rPr>
-                      <w:spacing w:val="-8"/>
-                      <w:sz w:val="26"/>
-                      <w:szCs w:val="26"/>
-                    </w:rPr>
-                    <w:t xml:space="preserve"> </w:t>
-                  </w:r>
-                  <w:proofErr w:type="spellStart"/>
-                  <w:r>
-                    <w:rPr>
-                      <w:spacing w:val="-8"/>
+                      <w:spacing w:val="4"/>
+                      <w:sz w:val="26"/>
+                      <w:szCs w:val="26"/>
+                    </w:rPr>
+                    <w:t xml:space="preserve"> </w:t>
+                  </w:r>
+                  <w:proofErr w:type="spellStart"/>
+                  <w:r>
+                    <w:rPr>
+                      <w:spacing w:val="4"/>
                       <w:sz w:val="26"/>
                       <w:szCs w:val="26"/>
                     </w:rPr>
@@ -5561,16 +5584,16 @@
                   <w:proofErr w:type="spellEnd"/>
                   <w:r>
                     <w:rPr>
-                      <w:spacing w:val="-8"/>
-                      <w:sz w:val="26"/>
-                      <w:szCs w:val="26"/>
-                    </w:rPr>
-                    <w:t xml:space="preserve"> </w:t>
-                  </w:r>
-                  <w:proofErr w:type="spellStart"/>
-                  <w:r>
-                    <w:rPr>
-                      <w:spacing w:val="-8"/>
+                      <w:spacing w:val="4"/>
+                      <w:sz w:val="26"/>
+                      <w:szCs w:val="26"/>
+                    </w:rPr>
+                    <w:t xml:space="preserve"> </w:t>
+                  </w:r>
+                  <w:proofErr w:type="spellStart"/>
+                  <w:r>
+                    <w:rPr>
+                      <w:spacing w:val="4"/>
                       <w:sz w:val="26"/>
                       <w:szCs w:val="26"/>
                     </w:rPr>
@@ -5579,7 +5602,7 @@
                   <w:proofErr w:type="spellEnd"/>
                   <w:r>
                     <w:rPr>
-                      <w:spacing w:val="-8"/>
+                      <w:spacing w:val="4"/>
                       <w:sz w:val="26"/>
                       <w:szCs w:val="26"/>
                     </w:rPr>
@@ -5588,7 +5611,7 @@
                   <w:proofErr w:type="spellStart"/>
                   <w:r>
                     <w:rPr>
-                      <w:spacing w:val="-8"/>
+                      <w:spacing w:val="4"/>
                       <w:sz w:val="26"/>
                       <w:szCs w:val="26"/>
                     </w:rPr>
@@ -5597,16 +5620,16 @@
                   <w:proofErr w:type="spellEnd"/>
                   <w:r>
                     <w:rPr>
-                      <w:spacing w:val="-8"/>
-                      <w:sz w:val="26"/>
-                      <w:szCs w:val="26"/>
-                    </w:rPr>
-                    <w:t xml:space="preserve"> </w:t>
-                  </w:r>
-                  <w:proofErr w:type="spellStart"/>
-                  <w:r>
-                    <w:rPr>
-                      <w:spacing w:val="-8"/>
+                      <w:spacing w:val="4"/>
+                      <w:sz w:val="26"/>
+                      <w:szCs w:val="26"/>
+                    </w:rPr>
+                    <w:t xml:space="preserve"> </w:t>
+                  </w:r>
+                  <w:proofErr w:type="spellStart"/>
+                  <w:r>
+                    <w:rPr>
+                      <w:spacing w:val="4"/>
                       <w:sz w:val="26"/>
                       <w:szCs w:val="26"/>
                     </w:rPr>
@@ -5615,16 +5638,16 @@
                   <w:proofErr w:type="spellEnd"/>
                   <w:r>
                     <w:rPr>
-                      <w:spacing w:val="-8"/>
-                      <w:sz w:val="26"/>
-                      <w:szCs w:val="26"/>
-                    </w:rPr>
-                    <w:t xml:space="preserve"> </w:t>
-                  </w:r>
-                  <w:proofErr w:type="spellStart"/>
-                  <w:r>
-                    <w:rPr>
-                      <w:spacing w:val="-8"/>
+                      <w:spacing w:val="4"/>
+                      <w:sz w:val="26"/>
+                      <w:szCs w:val="26"/>
+                    </w:rPr>
+                    <w:t xml:space="preserve"> </w:t>
+                  </w:r>
+                  <w:proofErr w:type="spellStart"/>
+                  <w:r>
+                    <w:rPr>
+                      <w:spacing w:val="4"/>
                       <w:sz w:val="26"/>
                       <w:szCs w:val="26"/>
                     </w:rPr>
@@ -5633,16 +5656,16 @@
                   <w:proofErr w:type="spellEnd"/>
                   <w:r>
                     <w:rPr>
-                      <w:spacing w:val="-8"/>
-                      <w:sz w:val="26"/>
-                      <w:szCs w:val="26"/>
-                    </w:rPr>
-                    <w:t xml:space="preserve"> </w:t>
-                  </w:r>
-                  <w:proofErr w:type="spellStart"/>
-                  <w:r>
-                    <w:rPr>
-                      <w:spacing w:val="-8"/>
+                      <w:spacing w:val="4"/>
+                      <w:sz w:val="26"/>
+                      <w:szCs w:val="26"/>
+                    </w:rPr>
+                    <w:t xml:space="preserve"> </w:t>
+                  </w:r>
+                  <w:proofErr w:type="spellStart"/>
+                  <w:r>
+                    <w:rPr>
+                      <w:spacing w:val="4"/>
                       <w:sz w:val="26"/>
                       <w:szCs w:val="26"/>
                     </w:rPr>
@@ -5651,7 +5674,7 @@
                   <w:proofErr w:type="spellEnd"/>
                   <w:r>
                     <w:rPr>
-                      <w:spacing w:val="-8"/>
+                      <w:spacing w:val="4"/>
                       <w:sz w:val="26"/>
                       <w:szCs w:val="26"/>
                     </w:rPr>
@@ -5660,7 +5683,7 @@
                   <w:proofErr w:type="spellStart"/>
                   <w:r>
                     <w:rPr>
-                      <w:spacing w:val="-8"/>
+                      <w:spacing w:val="4"/>
                       <w:sz w:val="26"/>
                       <w:szCs w:val="26"/>
                     </w:rPr>
@@ -5669,16 +5692,16 @@
                   <w:proofErr w:type="spellEnd"/>
                   <w:r>
                     <w:rPr>
-                      <w:spacing w:val="-8"/>
-                      <w:sz w:val="26"/>
-                      <w:szCs w:val="26"/>
-                    </w:rPr>
-                    <w:t xml:space="preserve"> </w:t>
-                  </w:r>
-                  <w:proofErr w:type="spellStart"/>
-                  <w:r>
-                    <w:rPr>
-                      <w:spacing w:val="-8"/>
+                      <w:spacing w:val="4"/>
+                      <w:sz w:val="26"/>
+                      <w:szCs w:val="26"/>
+                    </w:rPr>
+                    <w:t xml:space="preserve"> </w:t>
+                  </w:r>
+                  <w:proofErr w:type="spellStart"/>
+                  <w:r>
+                    <w:rPr>
+                      <w:spacing w:val="4"/>
                       <w:sz w:val="26"/>
                       <w:szCs w:val="26"/>
                     </w:rPr>
@@ -5687,16 +5710,16 @@
                   <w:proofErr w:type="spellEnd"/>
                   <w:r>
                     <w:rPr>
-                      <w:spacing w:val="-8"/>
-                      <w:sz w:val="26"/>
-                      <w:szCs w:val="26"/>
-                    </w:rPr>
-                    <w:t xml:space="preserve"> </w:t>
-                  </w:r>
-                  <w:proofErr w:type="spellStart"/>
-                  <w:r>
-                    <w:rPr>
-                      <w:spacing w:val="-8"/>
+                      <w:spacing w:val="4"/>
+                      <w:sz w:val="26"/>
+                      <w:szCs w:val="26"/>
+                    </w:rPr>
+                    <w:t xml:space="preserve"> </w:t>
+                  </w:r>
+                  <w:proofErr w:type="spellStart"/>
+                  <w:r>
+                    <w:rPr>
+                      <w:spacing w:val="4"/>
                       <w:sz w:val="26"/>
                       <w:szCs w:val="26"/>
                     </w:rPr>
@@ -5705,16 +5728,16 @@
                   <w:proofErr w:type="spellEnd"/>
                   <w:r>
                     <w:rPr>
-                      <w:spacing w:val="-8"/>
-                      <w:sz w:val="26"/>
-                      <w:szCs w:val="26"/>
-                    </w:rPr>
-                    <w:t xml:space="preserve"> </w:t>
-                  </w:r>
-                  <w:proofErr w:type="spellStart"/>
-                  <w:r>
-                    <w:rPr>
-                      <w:spacing w:val="-8"/>
+                      <w:spacing w:val="4"/>
+                      <w:sz w:val="26"/>
+                      <w:szCs w:val="26"/>
+                    </w:rPr>
+                    <w:t xml:space="preserve"> </w:t>
+                  </w:r>
+                  <w:proofErr w:type="spellStart"/>
+                  <w:r>
+                    <w:rPr>
+                      <w:spacing w:val="4"/>
                       <w:sz w:val="26"/>
                       <w:szCs w:val="26"/>
                     </w:rPr>
@@ -5723,16 +5746,16 @@
                   <w:proofErr w:type="spellEnd"/>
                   <w:r>
                     <w:rPr>
-                      <w:spacing w:val="-8"/>
-                      <w:sz w:val="26"/>
-                      <w:szCs w:val="26"/>
-                    </w:rPr>
-                    <w:t xml:space="preserve"> </w:t>
-                  </w:r>
-                  <w:proofErr w:type="spellStart"/>
-                  <w:r>
-                    <w:rPr>
-                      <w:spacing w:val="-8"/>
+                      <w:spacing w:val="4"/>
+                      <w:sz w:val="26"/>
+                      <w:szCs w:val="26"/>
+                    </w:rPr>
+                    <w:t xml:space="preserve"> </w:t>
+                  </w:r>
+                  <w:proofErr w:type="spellStart"/>
+                  <w:r>
+                    <w:rPr>
+                      <w:spacing w:val="4"/>
                       <w:sz w:val="26"/>
                       <w:szCs w:val="26"/>
                     </w:rPr>
@@ -5741,16 +5764,16 @@
                   <w:proofErr w:type="spellEnd"/>
                   <w:r>
                     <w:rPr>
-                      <w:spacing w:val="-8"/>
-                      <w:sz w:val="26"/>
-                      <w:szCs w:val="26"/>
-                    </w:rPr>
-                    <w:t xml:space="preserve"> </w:t>
-                  </w:r>
-                  <w:proofErr w:type="spellStart"/>
-                  <w:r>
-                    <w:rPr>
-                      <w:spacing w:val="-8"/>
+                      <w:spacing w:val="4"/>
+                      <w:sz w:val="26"/>
+                      <w:szCs w:val="26"/>
+                    </w:rPr>
+                    <w:t xml:space="preserve"> </w:t>
+                  </w:r>
+                  <w:proofErr w:type="spellStart"/>
+                  <w:r>
+                    <w:rPr>
+                      <w:spacing w:val="4"/>
                       <w:sz w:val="26"/>
                       <w:szCs w:val="26"/>
                     </w:rPr>
@@ -5759,16 +5782,16 @@
                   <w:proofErr w:type="spellEnd"/>
                   <w:r>
                     <w:rPr>
-                      <w:spacing w:val="-8"/>
-                      <w:sz w:val="26"/>
-                      <w:szCs w:val="26"/>
-                    </w:rPr>
-                    <w:t xml:space="preserve"> </w:t>
-                  </w:r>
-                  <w:proofErr w:type="spellStart"/>
-                  <w:r>
-                    <w:rPr>
-                      <w:spacing w:val="-8"/>
+                      <w:spacing w:val="4"/>
+                      <w:sz w:val="26"/>
+                      <w:szCs w:val="26"/>
+                    </w:rPr>
+                    <w:t xml:space="preserve"> </w:t>
+                  </w:r>
+                  <w:proofErr w:type="spellStart"/>
+                  <w:r>
+                    <w:rPr>
+                      <w:spacing w:val="4"/>
                       <w:sz w:val="26"/>
                       <w:szCs w:val="26"/>
                     </w:rPr>
@@ -5777,16 +5800,16 @@
                   <w:proofErr w:type="spellEnd"/>
                   <w:r>
                     <w:rPr>
-                      <w:spacing w:val="-8"/>
-                      <w:sz w:val="26"/>
-                      <w:szCs w:val="26"/>
-                    </w:rPr>
-                    <w:t xml:space="preserve"> </w:t>
-                  </w:r>
-                  <w:proofErr w:type="spellStart"/>
-                  <w:r>
-                    <w:rPr>
-                      <w:spacing w:val="-8"/>
+                      <w:spacing w:val="4"/>
+                      <w:sz w:val="26"/>
+                      <w:szCs w:val="26"/>
+                    </w:rPr>
+                    <w:t xml:space="preserve"> </w:t>
+                  </w:r>
+                  <w:proofErr w:type="spellStart"/>
+                  <w:r>
+                    <w:rPr>
+                      <w:spacing w:val="4"/>
                       <w:sz w:val="26"/>
                       <w:szCs w:val="26"/>
                     </w:rPr>
@@ -5795,16 +5818,16 @@
                   <w:proofErr w:type="spellEnd"/>
                   <w:r>
                     <w:rPr>
-                      <w:spacing w:val="-8"/>
-                      <w:sz w:val="26"/>
-                      <w:szCs w:val="26"/>
-                    </w:rPr>
-                    <w:t xml:space="preserve"> </w:t>
-                  </w:r>
-                  <w:proofErr w:type="spellStart"/>
-                  <w:r>
-                    <w:rPr>
-                      <w:spacing w:val="-8"/>
+                      <w:spacing w:val="4"/>
+                      <w:sz w:val="26"/>
+                      <w:szCs w:val="26"/>
+                    </w:rPr>
+                    <w:t xml:space="preserve"> </w:t>
+                  </w:r>
+                  <w:proofErr w:type="spellStart"/>
+                  <w:r>
+                    <w:rPr>
+                      <w:spacing w:val="4"/>
                       <w:sz w:val="26"/>
                       <w:szCs w:val="26"/>
                     </w:rPr>
@@ -5813,16 +5836,16 @@
                   <w:proofErr w:type="spellEnd"/>
                   <w:r>
                     <w:rPr>
-                      <w:spacing w:val="-8"/>
-                      <w:sz w:val="26"/>
-                      <w:szCs w:val="26"/>
-                    </w:rPr>
-                    <w:t xml:space="preserve"> </w:t>
-                  </w:r>
-                  <w:proofErr w:type="spellStart"/>
-                  <w:r>
-                    <w:rPr>
-                      <w:spacing w:val="-8"/>
+                      <w:spacing w:val="4"/>
+                      <w:sz w:val="26"/>
+                      <w:szCs w:val="26"/>
+                    </w:rPr>
+                    <w:t xml:space="preserve"> </w:t>
+                  </w:r>
+                  <w:proofErr w:type="spellStart"/>
+                  <w:r>
+                    <w:rPr>
+                      <w:spacing w:val="4"/>
                       <w:sz w:val="26"/>
                       <w:szCs w:val="26"/>
                     </w:rPr>
@@ -7835,14 +7858,7 @@
                       <w:sz w:val="26"/>
                       <w:szCs w:val="26"/>
                     </w:rPr>
-                    <w:t xml:space="preserve">- </w:t>
-                  </w:r>
-                  <w:r>
-                    <w:rPr>
-                      <w:sz w:val="26"/>
-                      <w:szCs w:val="26"/>
-                    </w:rPr>
-                    <w:t>D</w:t>
+                    <w:t>- D</w:t>
                   </w:r>
                   <w:r>
                     <w:rPr>
@@ -8121,14 +8137,7 @@
                       <w:sz w:val="26"/>
                       <w:szCs w:val="26"/>
                     </w:rPr>
-                    <w:t xml:space="preserve">- </w:t>
-                  </w:r>
-                  <w:r>
-                    <w:rPr>
-                      <w:sz w:val="26"/>
-                      <w:szCs w:val="26"/>
-                    </w:rPr>
-                    <w:t>T</w:t>
+                    <w:t>- T</w:t>
                   </w:r>
                   <w:r>
                     <w:rPr>
@@ -9062,14 +9071,7 @@
                       <w:sz w:val="26"/>
                       <w:szCs w:val="26"/>
                     </w:rPr>
-                    <w:t xml:space="preserve">- </w:t>
-                  </w:r>
-                  <w:r>
-                    <w:rPr>
-                      <w:sz w:val="26"/>
-                      <w:szCs w:val="26"/>
-                    </w:rPr>
-                    <w:t>H</w:t>
+                    <w:t>- H</w:t>
                   </w:r>
                   <w:r>
                     <w:rPr>
@@ -14331,6 +14333,50 @@
     <w:lsdException w:name="Subtitle" w:qFormat="1"/>
     <w:lsdException w:name="Strong" w:qFormat="1"/>
     <w:lsdException w:name="Emphasis" w:qFormat="1"/>
+    <w:lsdException w:name="Normal Table" w:semiHidden="1" w:unhideWhenUsed="1"/>
+    <w:lsdException w:name="Table Simple 1" w:semiHidden="1" w:unhideWhenUsed="1"/>
+    <w:lsdException w:name="Table Simple 2" w:semiHidden="1" w:unhideWhenUsed="1"/>
+    <w:lsdException w:name="Table Simple 3" w:semiHidden="1" w:unhideWhenUsed="1"/>
+    <w:lsdException w:name="Table Classic 1" w:semiHidden="1" w:unhideWhenUsed="1"/>
+    <w:lsdException w:name="Table Classic 2" w:semiHidden="1" w:unhideWhenUsed="1"/>
+    <w:lsdException w:name="Table Classic 3" w:semiHidden="1" w:unhideWhenUsed="1"/>
+    <w:lsdException w:name="Table Classic 4" w:semiHidden="1" w:unhideWhenUsed="1"/>
+    <w:lsdException w:name="Table Colorful 1" w:semiHidden="1" w:unhideWhenUsed="1"/>
+    <w:lsdException w:name="Table Colorful 2" w:semiHidden="1" w:unhideWhenUsed="1"/>
+    <w:lsdException w:name="Table Colorful 3" w:semiHidden="1" w:unhideWhenUsed="1"/>
+    <w:lsdException w:name="Table Columns 1" w:semiHidden="1" w:unhideWhenUsed="1"/>
+    <w:lsdException w:name="Table Columns 2" w:semiHidden="1" w:unhideWhenUsed="1"/>
+    <w:lsdException w:name="Table Columns 3" w:semiHidden="1" w:unhideWhenUsed="1"/>
+    <w:lsdException w:name="Table Columns 4" w:semiHidden="1" w:unhideWhenUsed="1"/>
+    <w:lsdException w:name="Table Columns 5" w:semiHidden="1" w:unhideWhenUsed="1"/>
+    <w:lsdException w:name="Table Grid 1" w:semiHidden="1" w:unhideWhenUsed="1"/>
+    <w:lsdException w:name="Table Grid 2" w:semiHidden="1" w:unhideWhenUsed="1"/>
+    <w:lsdException w:name="Table Grid 3" w:semiHidden="1" w:unhideWhenUsed="1"/>
+    <w:lsdException w:name="Table Grid 4" w:semiHidden="1" w:unhideWhenUsed="1"/>
+    <w:lsdException w:name="Table Grid 5" w:semiHidden="1" w:unhideWhenUsed="1"/>
+    <w:lsdException w:name="Table Grid 6" w:semiHidden="1" w:unhideWhenUsed="1"/>
+    <w:lsdException w:name="Table Grid 7" w:semiHidden="1" w:unhideWhenUsed="1"/>
+    <w:lsdException w:name="Table Grid 8" w:semiHidden="1" w:unhideWhenUsed="1"/>
+    <w:lsdException w:name="Table List 1" w:semiHidden="1" w:unhideWhenUsed="1"/>
+    <w:lsdException w:name="Table List 2" w:semiHidden="1" w:unhideWhenUsed="1"/>
+    <w:lsdException w:name="Table List 3" w:semiHidden="1" w:unhideWhenUsed="1"/>
+    <w:lsdException w:name="Table List 4" w:semiHidden="1" w:unhideWhenUsed="1"/>
+    <w:lsdException w:name="Table List 5" w:semiHidden="1" w:unhideWhenUsed="1"/>
+    <w:lsdException w:name="Table List 6" w:semiHidden="1" w:unhideWhenUsed="1"/>
+    <w:lsdException w:name="Table List 7" w:semiHidden="1" w:unhideWhenUsed="1"/>
+    <w:lsdException w:name="Table List 8" w:semiHidden="1" w:unhideWhenUsed="1"/>
+    <w:lsdException w:name="Table 3D effects 1" w:semiHidden="1" w:unhideWhenUsed="1"/>
+    <w:lsdException w:name="Table 3D effects 2" w:semiHidden="1" w:unhideWhenUsed="1"/>
+    <w:lsdException w:name="Table 3D effects 3" w:semiHidden="1" w:unhideWhenUsed="1"/>
+    <w:lsdException w:name="Table Contemporary" w:semiHidden="1" w:unhideWhenUsed="1"/>
+    <w:lsdException w:name="Table Elegant" w:semiHidden="1" w:unhideWhenUsed="1"/>
+    <w:lsdException w:name="Table Professional" w:semiHidden="1" w:unhideWhenUsed="1"/>
+    <w:lsdException w:name="Table Subtle 1" w:semiHidden="1" w:unhideWhenUsed="1"/>
+    <w:lsdException w:name="Table Subtle 2" w:semiHidden="1" w:unhideWhenUsed="1"/>
+    <w:lsdException w:name="Table Web 1" w:semiHidden="1" w:unhideWhenUsed="1"/>
+    <w:lsdException w:name="Table Web 2" w:semiHidden="1" w:unhideWhenUsed="1"/>
+    <w:lsdException w:name="Table Web 3" w:semiHidden="1" w:unhideWhenUsed="1"/>
+    <w:lsdException w:name="Table Theme" w:semiHidden="1" w:unhideWhenUsed="1"/>
     <w:lsdException w:name="Placeholder Text" w:semiHidden="1" w:uiPriority="99"/>
     <w:lsdException w:name="No Spacing" w:uiPriority="1" w:qFormat="1"/>
     <w:lsdException w:name="Light Shading" w:uiPriority="60"/>
@@ -14608,11 +14654,15 @@
   </w:style>
   <w:style w:type="character" w:default="1" w:styleId="DefaultParagraphFont">
     <w:name w:val="Default Paragraph Font"/>
+    <w:uiPriority w:val="1"/>
     <w:semiHidden/>
+    <w:unhideWhenUsed/>
   </w:style>
   <w:style w:type="table" w:default="1" w:styleId="TableNormal">
     <w:name w:val="Normal Table"/>
+    <w:uiPriority w:val="99"/>
     <w:semiHidden/>
+    <w:unhideWhenUsed/>
     <w:tblPr>
       <w:tblInd w:w="0" w:type="dxa"/>
       <w:tblCellMar>
@@ -14625,7 +14675,9 @@
   </w:style>
   <w:style w:type="numbering" w:default="1" w:styleId="NoList">
     <w:name w:val="No List"/>
+    <w:uiPriority w:val="99"/>
     <w:semiHidden/>
+    <w:unhideWhenUsed/>
   </w:style>
   <w:style w:type="paragraph" w:styleId="Footer">
     <w:name w:val="footer"/>

</xml_diff>